<commit_message>
Add comprehensive unit tests for Counter-UAS chain functionality
- Implement tests for zone containment, distance calculations, and time to entry.
- Add guidance tests for stationary and moving targets.
- Include tracker tests for target tracking and IFF suppression.
- Create sensor range tests for acoustic and seismic sensors.
- Develop end-to-end tests for engagement scenarios with auto ROE and operator approval.
- Introduce full attack tests to validate convoy and escort behavior under various conditions.
- Set up a fake Artemides server for integration tests with route planning and threat publishing.
- Ensure drivability and laydown tests cover terrain classification and editing functionality.
</commit_message>
<xml_diff>
--- a/projektovanje-softvera/docs/ispit.docx
+++ b/projektovanje-softvera/docs/ispit.docx
@@ -3435,9 +3435,7 @@
         </w:rPr>
       </w:pPr>
       <w:r>
-        <w:rPr>
-          <w:lang w:val="sr-Latn-RS"/>
-        </w:rPr>
+        <w:rPr/>
         <w:drawing>
           <wp:inline distT="0" distB="0" distL="0" distR="0">
             <wp:extent cx="2654935" cy="5419725"/>
@@ -5587,9 +5585,7 @@
         </w:rPr>
       </w:pPr>
       <w:r>
-        <w:rPr>
-          <w:lang w:val="sr-Latn-RS"/>
-        </w:rPr>
+        <w:rPr/>
         <w:drawing>
           <wp:inline distT="0" distB="0" distL="0" distR="0">
             <wp:extent cx="5400040" cy="2126615"/>
@@ -5892,9 +5888,7 @@
         </w:rPr>
       </w:pPr>
       <w:r>
-        <w:rPr>
-          <w:lang w:val="sr-Latn-RS"/>
-        </w:rPr>
+        <w:rPr/>
         <w:drawing>
           <wp:inline distT="0" distB="0" distL="0" distR="0">
             <wp:extent cx="5039995" cy="5210175"/>
@@ -6195,9 +6189,7 @@
         </w:rPr>
       </w:pPr>
       <w:r>
-        <w:rPr>
-          <w:lang w:val="sr-Latn-RS"/>
-        </w:rPr>
+        <w:rPr/>
         <w:drawing>
           <wp:inline distT="0" distB="0" distL="0" distR="0">
             <wp:extent cx="4276725" cy="6224905"/>
@@ -6540,9 +6532,7 @@
         </w:rPr>
       </w:pPr>
       <w:r>
-        <w:rPr>
-          <w:lang w:val="sr-Latn-RS"/>
-        </w:rPr>
+        <w:rPr/>
         <w:drawing>
           <wp:inline distT="0" distB="0" distL="0" distR="0">
             <wp:extent cx="5039995" cy="5114925"/>
@@ -6907,9 +6897,7 @@
         </w:rPr>
       </w:pPr>
       <w:r>
-        <w:rPr>
-          <w:lang w:val="sr-Latn-RS"/>
-        </w:rPr>
+        <w:rPr/>
         <w:drawing>
           <wp:inline distT="0" distB="0" distL="0" distR="0">
             <wp:extent cx="6766560" cy="7355840"/>
@@ -7407,9 +7395,7 @@
         </w:rPr>
       </w:pPr>
       <w:r>
-        <w:rPr>
-          <w:lang w:val="sr-Latn-RS"/>
-        </w:rPr>
+        <w:rPr/>
         <w:drawing>
           <wp:inline distT="0" distB="0" distL="0" distR="0">
             <wp:extent cx="6577330" cy="5635625"/>
@@ -7937,9 +7923,7 @@
         </w:rPr>
       </w:pPr>
       <w:r>
-        <w:rPr>
-          <w:lang w:val="sr-Latn-RS"/>
-        </w:rPr>
+        <w:rPr/>
         <w:drawing>
           <wp:inline distT="0" distB="0" distL="0" distR="0">
             <wp:extent cx="6766560" cy="2972435"/>
@@ -9020,9 +9004,7 @@
         </w:rPr>
       </w:pPr>
       <w:r>
-        <w:rPr>
-          <w:lang w:val="sr-Latn-RS"/>
-        </w:rPr>
+        <w:rPr/>
         <w:drawing>
           <wp:inline distT="0" distB="0" distL="0" distR="0">
             <wp:extent cx="4089400" cy="8481060"/>
@@ -9785,9 +9767,7 @@
         </w:rPr>
       </w:pPr>
       <w:r>
-        <w:rPr>
-          <w:lang w:val="sr-Latn-RS"/>
-        </w:rPr>
+        <w:rPr/>
         <w:drawing>
           <wp:inline distT="0" distB="0" distL="0" distR="0">
             <wp:extent cx="6553200" cy="8481060"/>
@@ -11058,9 +11038,7 @@
         </w:rPr>
       </w:pPr>
       <w:r>
-        <w:rPr>
-          <w:lang w:val="sr-Latn-RS"/>
-        </w:rPr>
+        <w:rPr/>
         <w:drawing>
           <wp:inline distT="0" distB="0" distL="0" distR="0">
             <wp:extent cx="6639560" cy="3778250"/>
@@ -12580,9 +12558,7 @@
         </w:rPr>
       </w:pPr>
       <w:r>
-        <w:rPr>
-          <w:lang w:val="sr-Latn-RS"/>
-        </w:rPr>
+        <w:rPr/>
         <w:drawing>
           <wp:inline distT="0" distB="0" distL="0" distR="0">
             <wp:extent cx="6639560" cy="1859280"/>
@@ -13615,7 +13591,25 @@
           <w:sz w:val="22"/>
           <w:lang w:val="sr-Latn-RS"/>
         </w:rPr>
-        <w:t>Hijerarhija zavisnosti (odgore prema dolje):</w:t>
+        <w:t>Hijerarhija zavisnosti (o</w:t>
+      </w:r>
+      <w:r>
+        <w:rPr>
+          <w:b/>
+          <w:i w:val="false"/>
+          <w:sz w:val="22"/>
+          <w:lang w:val="sr-Latn-RS"/>
+        </w:rPr>
+        <w:t>dozgo</w:t>
+      </w:r>
+      <w:r>
+        <w:rPr>
+          <w:b/>
+          <w:i w:val="false"/>
+          <w:sz w:val="22"/>
+          <w:lang w:val="sr-Latn-RS"/>
+        </w:rPr>
+        <w:t xml:space="preserve"> prema dole):</w:t>
       </w:r>
     </w:p>
     <w:p>
@@ -13653,7 +13647,25 @@
           <w:sz w:val="22"/>
           <w:lang w:val="sr-Latn-RS"/>
         </w:rPr>
-        <w:t>Princip koji se poštuje: viši slojevi zavise od nižih, ali niži slojevi nikada ne zavise od viših (Dependency Inversion Principle). Krozni zavisnosti su eksplicitno zabranjene.</w:t>
+        <w:t xml:space="preserve">Princip koji se poštuje: viši slojevi zavise od nižih, ali niži slojevi nikada ne zavise od viših (Dependency Inversion Principle). </w:t>
+      </w:r>
+      <w:r>
+        <w:rPr>
+          <w:b w:val="false"/>
+          <w:i w:val="false"/>
+          <w:sz w:val="22"/>
+          <w:lang w:val="sr-Latn-RS"/>
+        </w:rPr>
+        <w:t>Obratne</w:t>
+      </w:r>
+      <w:r>
+        <w:rPr>
+          <w:b w:val="false"/>
+          <w:i w:val="false"/>
+          <w:sz w:val="22"/>
+          <w:lang w:val="sr-Latn-RS"/>
+        </w:rPr>
+        <w:t xml:space="preserve"> zavisnosti su eksplicitno zabranjene.</w:t>
       </w:r>
     </w:p>
     <w:p>
@@ -13665,9 +13677,7 @@
         </w:rPr>
       </w:pPr>
       <w:r>
-        <w:rPr>
-          <w:lang w:val="sr-Latn-RS"/>
-        </w:rPr>
+        <w:rPr/>
         <w:drawing>
           <wp:inline distT="0" distB="0" distL="0" distR="0">
             <wp:extent cx="6766560" cy="3333115"/>
@@ -14984,9 +14994,7 @@
         </w:rPr>
       </w:pPr>
       <w:r>
-        <w:rPr>
-          <w:lang w:val="sr-Latn-RS"/>
-        </w:rPr>
+        <w:rPr/>
         <w:drawing>
           <wp:inline distT="0" distB="0" distL="0" distR="0">
             <wp:extent cx="6799580" cy="2070735"/>
@@ -16213,7 +16221,7 @@
     </w:r>
     <w:r>
       <w:rPr/>
-      <w:t>02</w:t>
+      <w:t>26</w:t>
     </w:r>
     <w:r>
       <w:rPr/>
@@ -16245,7 +16253,7 @@
     </w:r>
     <w:r>
       <w:rPr/>
-      <w:t>02</w:t>
+      <w:t>26</w:t>
     </w:r>
     <w:r>
       <w:rPr/>

</xml_diff>